<commit_message>
Use Zenodo concept DOI
</commit_message>
<xml_diff>
--- a/manuscript_comparative_study.docx
+++ b/manuscript_comparative_study.docx
@@ -2614,7 +2614,7 @@
           <w:sz w:val="22"/>
           <w:szCs w:val="22"/>
         </w:rPr>
-        <w:t xml:space="preserve">All analysis code, processed input files, cleaned matrices, reproducibility outputs, summary tables, fold-wise target-selection audit tables, baseline tables, SHAP attribution tables, permutation-test outputs, and figure-generation scripts are archived on Zenodo at https://doi.org/10.5281/zenodo.21283918 [21]. The corresponding live GitHub repository is available at https://github.com/bobsbuiscuit123/osd914-analysis. The raw miRNA expression data underlying this study are available through the RRRM-1/RR-8 NASA OSDR study records and the corresponding NCBI GEO series GSE294046. Figures 2-5 were generated from the cleaned matrices available at the Zenodo archive; Figure 1 is a schematic of the computational workflow rather than a data-derived plot. The canonical reproducibility entry point is reproduce.py, which selects brain targets independently inside each outer LOOCV training fold; running make reproduce rebuilds the clean liver and brain matrices, LOOCV metrics, prediction tables, fold-wise target-selection audit tables, SHAP attribution summaries, figures, and dashboard under the reproducibility/ directory, and make baselines regenerates the model-comparison tables and figures reported in Section 3.1. The current subject-pairing permutation null for the MLP under this fold-wise pipeline was generated with .venv/bin/python baselines.py --permutations 1000; the summary p-value is stored in reproducibility/baseline_metrics.json, and the full null distribution and pairings are stored in reproducibility/tables/permutation_mlp_vmse.csv, reproducibility/tables/permutation_mlp_seed_vmse.csv, and reproducibility/tables/permutation_pairings.csv.</w:t>
+        <w:t xml:space="preserve">All analysis code, processed input files, cleaned matrices, reproducibility outputs, summary tables, fold-wise target-selection audit tables, baseline tables, SHAP attribution tables, permutation-test outputs, and figure-generation scripts are archived on Zenodo at https://doi.org/10.5281/zenodo.21283917 [21]. The corresponding live GitHub repository is available at https://github.com/bobsbuiscuit123/osd914-analysis. The raw miRNA expression data underlying this study are available through the RRRM-1/RR-8 NASA OSDR study records and the corresponding NCBI GEO series GSE294046. Figures 2-5 were generated from the cleaned matrices available at the Zenodo archive; Figure 1 is a schematic of the computational workflow rather than a data-derived plot. The canonical reproducibility entry point is reproduce.py, which selects brain targets independently inside each outer LOOCV training fold; running make reproduce rebuilds the clean liver and brain matrices, LOOCV metrics, prediction tables, fold-wise target-selection audit tables, SHAP attribution summaries, figures, and dashboard under the reproducibility/ directory, and make baselines regenerates the model-comparison tables and figures reported in Section 3.1. The current subject-pairing permutation null for the MLP under this fold-wise pipeline was generated with .venv/bin/python baselines.py --permutations 1000; the summary p-value is stored in reproducibility/baseline_metrics.json, and the full null distribution and pairings are stored in reproducibility/tables/permutation_mlp_vmse.csv, reproducibility/tables/permutation_mlp_seed_vmse.csv, and reproducibility/tables/permutation_pairings.csv.</w:t>
       </w:r>
     </w:p>
     <w:p>
@@ -3277,7 +3277,7 @@
           <w:sz w:val="20"/>
           <w:szCs w:val="20"/>
         </w:rPr>
-        <w:t xml:space="preserve">21. Mukkavilli, P., Medeiros, M., Prahl, R. &amp; Palmer, X. L. Reproducibility package for predictive modeling of spaceflight-induced microRNA co-expression patterns. Zenodo https://doi.org/10.5281/zenodo.21283918 (2026).</w:t>
+        <w:t xml:space="preserve">21. Mukkavilli, P., Medeiros, M., Prahl, R. &amp; Palmer, X. L. Reproducibility package for predictive modeling of spaceflight-induced microRNA co-expression patterns. Zenodo https://doi.org/10.5281/zenodo.21283917 (2026).</w:t>
       </w:r>
     </w:p>
     <w:p>

</xml_diff>